<commit_message>
docs(kitapcik): 2. baski - is bolme + sifirdan insa asamalari
Yeni bolumler:
17. Isi Parcalara Bolme: WorkStep alanlari, plan_steps() ve parcalama
    algoritmasi (chunk_ratio, chunk_steps=8, tavan=butce x oran),
    yurutme (run/run_until_done), JSONL gunluk, resume_state/pending_steps
18. Sifirdan Insa: 8 asama (dogrulama, veri havuzu, egitim, degerlendirme,
    dusunme+arastirma, talimat, ortak havuz, kararlilik) - her biri
    olculmus sonuc ve dersle; Blender hatti; degismez yontem

Ayrica: tablo satirlari sayfa arasinda bolunmuyor, baslik satiri
tekrarlaniyor. 14 sayfa, 39 baslik, 15 tablo.
</commit_message>
<xml_diff>
--- a/docs/NeuroCore-Kitapcik.docx
+++ b/docs/NeuroCore-Kitapcik.docx
@@ -246,6 +246,22 @@
       </w:pPr>
       <w:r>
         <w:t>16. Sözlük</w:t>
+      </w:r>
+    </w:p>
+    <w:p>
+      <w:pPr>
+        <w:spacing w:after="40"/>
+      </w:pPr>
+      <w:r>
+        <w:t>17. İşi Parçalara Bölme (WorkStep · parça · günlük · devam)</w:t>
+      </w:r>
+    </w:p>
+    <w:p>
+      <w:pPr>
+        <w:spacing w:after="40"/>
+      </w:pPr>
+      <w:r>
+        <w:t>18. Sıfırdan İnşa: Geliştirme Aşamaları</w:t>
       </w:r>
     </w:p>
     <w:p>
@@ -322,6 +338,10 @@
         <w:gridCol w:w="3324"/>
       </w:tblGrid>
       <w:tr>
+        <w:trPr>
+          <w:cantSplit/>
+          <w:tblHeader/>
+        </w:trPr>
         <w:tc>
           <w:tcPr>
             <w:tcW w:type="dxa" w:w="3324"/>
@@ -372,6 +392,9 @@
         </w:tc>
       </w:tr>
       <w:tr>
+        <w:trPr>
+          <w:cantSplit/>
+        </w:trPr>
         <w:tc>
           <w:tcPr>
             <w:tcW w:type="dxa" w:w="3324"/>
@@ -416,6 +439,9 @@
         </w:tc>
       </w:tr>
       <w:tr>
+        <w:trPr>
+          <w:cantSplit/>
+        </w:trPr>
         <w:tc>
           <w:tcPr>
             <w:tcW w:type="dxa" w:w="3324"/>
@@ -460,6 +486,9 @@
         </w:tc>
       </w:tr>
       <w:tr>
+        <w:trPr>
+          <w:cantSplit/>
+        </w:trPr>
         <w:tc>
           <w:tcPr>
             <w:tcW w:type="dxa" w:w="3324"/>
@@ -504,6 +533,9 @@
         </w:tc>
       </w:tr>
       <w:tr>
+        <w:trPr>
+          <w:cantSplit/>
+        </w:trPr>
         <w:tc>
           <w:tcPr>
             <w:tcW w:type="dxa" w:w="3324"/>
@@ -548,6 +580,9 @@
         </w:tc>
       </w:tr>
       <w:tr>
+        <w:trPr>
+          <w:cantSplit/>
+        </w:trPr>
         <w:tc>
           <w:tcPr>
             <w:tcW w:type="dxa" w:w="3324"/>
@@ -592,6 +627,9 @@
         </w:tc>
       </w:tr>
       <w:tr>
+        <w:trPr>
+          <w:cantSplit/>
+        </w:trPr>
         <w:tc>
           <w:tcPr>
             <w:tcW w:type="dxa" w:w="3324"/>
@@ -636,6 +674,9 @@
         </w:tc>
       </w:tr>
       <w:tr>
+        <w:trPr>
+          <w:cantSplit/>
+        </w:trPr>
         <w:tc>
           <w:tcPr>
             <w:tcW w:type="dxa" w:w="3324"/>
@@ -680,6 +721,9 @@
         </w:tc>
       </w:tr>
       <w:tr>
+        <w:trPr>
+          <w:cantSplit/>
+        </w:trPr>
         <w:tc>
           <w:tcPr>
             <w:tcW w:type="dxa" w:w="3324"/>
@@ -755,6 +799,10 @@
         <w:gridCol w:w="3324"/>
       </w:tblGrid>
       <w:tr>
+        <w:trPr>
+          <w:cantSplit/>
+          <w:tblHeader/>
+        </w:trPr>
         <w:tc>
           <w:tcPr>
             <w:tcW w:type="dxa" w:w="3324"/>
@@ -805,6 +853,9 @@
         </w:tc>
       </w:tr>
       <w:tr>
+        <w:trPr>
+          <w:cantSplit/>
+        </w:trPr>
         <w:tc>
           <w:tcPr>
             <w:tcW w:type="dxa" w:w="3324"/>
@@ -849,6 +900,9 @@
         </w:tc>
       </w:tr>
       <w:tr>
+        <w:trPr>
+          <w:cantSplit/>
+        </w:trPr>
         <w:tc>
           <w:tcPr>
             <w:tcW w:type="dxa" w:w="3324"/>
@@ -893,6 +947,9 @@
         </w:tc>
       </w:tr>
       <w:tr>
+        <w:trPr>
+          <w:cantSplit/>
+        </w:trPr>
         <w:tc>
           <w:tcPr>
             <w:tcW w:type="dxa" w:w="3324"/>
@@ -937,6 +994,9 @@
         </w:tc>
       </w:tr>
       <w:tr>
+        <w:trPr>
+          <w:cantSplit/>
+        </w:trPr>
         <w:tc>
           <w:tcPr>
             <w:tcW w:type="dxa" w:w="3324"/>
@@ -981,6 +1041,9 @@
         </w:tc>
       </w:tr>
       <w:tr>
+        <w:trPr>
+          <w:cantSplit/>
+        </w:trPr>
         <w:tc>
           <w:tcPr>
             <w:tcW w:type="dxa" w:w="3324"/>
@@ -1025,6 +1088,9 @@
         </w:tc>
       </w:tr>
       <w:tr>
+        <w:trPr>
+          <w:cantSplit/>
+        </w:trPr>
         <w:tc>
           <w:tcPr>
             <w:tcW w:type="dxa" w:w="3324"/>
@@ -1069,6 +1135,9 @@
         </w:tc>
       </w:tr>
       <w:tr>
+        <w:trPr>
+          <w:cantSplit/>
+        </w:trPr>
         <w:tc>
           <w:tcPr>
             <w:tcW w:type="dxa" w:w="3324"/>
@@ -1113,6 +1182,9 @@
         </w:tc>
       </w:tr>
       <w:tr>
+        <w:trPr>
+          <w:cantSplit/>
+        </w:trPr>
         <w:tc>
           <w:tcPr>
             <w:tcW w:type="dxa" w:w="3324"/>
@@ -1157,6 +1229,9 @@
         </w:tc>
       </w:tr>
       <w:tr>
+        <w:trPr>
+          <w:cantSplit/>
+        </w:trPr>
         <w:tc>
           <w:tcPr>
             <w:tcW w:type="dxa" w:w="3324"/>
@@ -1201,6 +1276,9 @@
         </w:tc>
       </w:tr>
       <w:tr>
+        <w:trPr>
+          <w:cantSplit/>
+        </w:trPr>
         <w:tc>
           <w:tcPr>
             <w:tcW w:type="dxa" w:w="3324"/>
@@ -1245,6 +1323,9 @@
         </w:tc>
       </w:tr>
       <w:tr>
+        <w:trPr>
+          <w:cantSplit/>
+        </w:trPr>
         <w:tc>
           <w:tcPr>
             <w:tcW w:type="dxa" w:w="3324"/>
@@ -2202,6 +2283,10 @@
         <w:gridCol w:w="3324"/>
       </w:tblGrid>
       <w:tr>
+        <w:trPr>
+          <w:cantSplit/>
+          <w:tblHeader/>
+        </w:trPr>
         <w:tc>
           <w:tcPr>
             <w:tcW w:type="dxa" w:w="3324"/>
@@ -2252,6 +2337,9 @@
         </w:tc>
       </w:tr>
       <w:tr>
+        <w:trPr>
+          <w:cantSplit/>
+        </w:trPr>
         <w:tc>
           <w:tcPr>
             <w:tcW w:type="dxa" w:w="3324"/>
@@ -2296,6 +2384,9 @@
         </w:tc>
       </w:tr>
       <w:tr>
+        <w:trPr>
+          <w:cantSplit/>
+        </w:trPr>
         <w:tc>
           <w:tcPr>
             <w:tcW w:type="dxa" w:w="3324"/>
@@ -2340,6 +2431,9 @@
         </w:tc>
       </w:tr>
       <w:tr>
+        <w:trPr>
+          <w:cantSplit/>
+        </w:trPr>
         <w:tc>
           <w:tcPr>
             <w:tcW w:type="dxa" w:w="3324"/>
@@ -2384,6 +2478,9 @@
         </w:tc>
       </w:tr>
       <w:tr>
+        <w:trPr>
+          <w:cantSplit/>
+        </w:trPr>
         <w:tc>
           <w:tcPr>
             <w:tcW w:type="dxa" w:w="3324"/>
@@ -2428,6 +2525,9 @@
         </w:tc>
       </w:tr>
       <w:tr>
+        <w:trPr>
+          <w:cantSplit/>
+        </w:trPr>
         <w:tc>
           <w:tcPr>
             <w:tcW w:type="dxa" w:w="3324"/>
@@ -2472,6 +2572,9 @@
         </w:tc>
       </w:tr>
       <w:tr>
+        <w:trPr>
+          <w:cantSplit/>
+        </w:trPr>
         <w:tc>
           <w:tcPr>
             <w:tcW w:type="dxa" w:w="3324"/>
@@ -2516,6 +2619,9 @@
         </w:tc>
       </w:tr>
       <w:tr>
+        <w:trPr>
+          <w:cantSplit/>
+        </w:trPr>
         <w:tc>
           <w:tcPr>
             <w:tcW w:type="dxa" w:w="3324"/>
@@ -2560,6 +2666,9 @@
         </w:tc>
       </w:tr>
       <w:tr>
+        <w:trPr>
+          <w:cantSplit/>
+        </w:trPr>
         <w:tc>
           <w:tcPr>
             <w:tcW w:type="dxa" w:w="3324"/>
@@ -3099,6 +3208,10 @@
         <w:gridCol w:w="1662"/>
       </w:tblGrid>
       <w:tr>
+        <w:trPr>
+          <w:cantSplit/>
+          <w:tblHeader/>
+        </w:trPr>
         <w:tc>
           <w:tcPr>
             <w:tcW w:type="dxa" w:w="1662"/>
@@ -3197,6 +3310,9 @@
         </w:tc>
       </w:tr>
       <w:tr>
+        <w:trPr>
+          <w:cantSplit/>
+        </w:trPr>
         <w:tc>
           <w:tcPr>
             <w:tcW w:type="dxa" w:w="1662"/>
@@ -3283,6 +3399,9 @@
         </w:tc>
       </w:tr>
       <w:tr>
+        <w:trPr>
+          <w:cantSplit/>
+        </w:trPr>
         <w:tc>
           <w:tcPr>
             <w:tcW w:type="dxa" w:w="1662"/>
@@ -3369,6 +3488,9 @@
         </w:tc>
       </w:tr>
       <w:tr>
+        <w:trPr>
+          <w:cantSplit/>
+        </w:trPr>
         <w:tc>
           <w:tcPr>
             <w:tcW w:type="dxa" w:w="1662"/>
@@ -3455,6 +3577,9 @@
         </w:tc>
       </w:tr>
       <w:tr>
+        <w:trPr>
+          <w:cantSplit/>
+        </w:trPr>
         <w:tc>
           <w:tcPr>
             <w:tcW w:type="dxa" w:w="1662"/>
@@ -3666,6 +3791,10 @@
         <w:gridCol w:w="4986"/>
       </w:tblGrid>
       <w:tr>
+        <w:trPr>
+          <w:cantSplit/>
+          <w:tblHeader/>
+        </w:trPr>
         <w:tc>
           <w:tcPr>
             <w:tcW w:type="dxa" w:w="4986"/>
@@ -3700,6 +3829,9 @@
         </w:tc>
       </w:tr>
       <w:tr>
+        <w:trPr>
+          <w:cantSplit/>
+        </w:trPr>
         <w:tc>
           <w:tcPr>
             <w:tcW w:type="dxa" w:w="4986"/>
@@ -3730,6 +3862,9 @@
         </w:tc>
       </w:tr>
       <w:tr>
+        <w:trPr>
+          <w:cantSplit/>
+        </w:trPr>
         <w:tc>
           <w:tcPr>
             <w:tcW w:type="dxa" w:w="4986"/>
@@ -3760,6 +3895,9 @@
         </w:tc>
       </w:tr>
       <w:tr>
+        <w:trPr>
+          <w:cantSplit/>
+        </w:trPr>
         <w:tc>
           <w:tcPr>
             <w:tcW w:type="dxa" w:w="4986"/>
@@ -3790,6 +3928,9 @@
         </w:tc>
       </w:tr>
       <w:tr>
+        <w:trPr>
+          <w:cantSplit/>
+        </w:trPr>
         <w:tc>
           <w:tcPr>
             <w:tcW w:type="dxa" w:w="4986"/>
@@ -4081,6 +4222,10 @@
         <w:gridCol w:w="4986"/>
       </w:tblGrid>
       <w:tr>
+        <w:trPr>
+          <w:cantSplit/>
+          <w:tblHeader/>
+        </w:trPr>
         <w:tc>
           <w:tcPr>
             <w:tcW w:type="dxa" w:w="4986"/>
@@ -4115,6 +4260,9 @@
         </w:tc>
       </w:tr>
       <w:tr>
+        <w:trPr>
+          <w:cantSplit/>
+        </w:trPr>
         <w:tc>
           <w:tcPr>
             <w:tcW w:type="dxa" w:w="4986"/>
@@ -4145,6 +4293,9 @@
         </w:tc>
       </w:tr>
       <w:tr>
+        <w:trPr>
+          <w:cantSplit/>
+        </w:trPr>
         <w:tc>
           <w:tcPr>
             <w:tcW w:type="dxa" w:w="4986"/>
@@ -4175,6 +4326,9 @@
         </w:tc>
       </w:tr>
       <w:tr>
+        <w:trPr>
+          <w:cantSplit/>
+        </w:trPr>
         <w:tc>
           <w:tcPr>
             <w:tcW w:type="dxa" w:w="4986"/>
@@ -4205,6 +4359,9 @@
         </w:tc>
       </w:tr>
       <w:tr>
+        <w:trPr>
+          <w:cantSplit/>
+        </w:trPr>
         <w:tc>
           <w:tcPr>
             <w:tcW w:type="dxa" w:w="4986"/>
@@ -4235,6 +4392,9 @@
         </w:tc>
       </w:tr>
       <w:tr>
+        <w:trPr>
+          <w:cantSplit/>
+        </w:trPr>
         <w:tc>
           <w:tcPr>
             <w:tcW w:type="dxa" w:w="4986"/>
@@ -4265,6 +4425,9 @@
         </w:tc>
       </w:tr>
       <w:tr>
+        <w:trPr>
+          <w:cantSplit/>
+        </w:trPr>
         <w:tc>
           <w:tcPr>
             <w:tcW w:type="dxa" w:w="4986"/>
@@ -4295,6 +4458,9 @@
         </w:tc>
       </w:tr>
       <w:tr>
+        <w:trPr>
+          <w:cantSplit/>
+        </w:trPr>
         <w:tc>
           <w:tcPr>
             <w:tcW w:type="dxa" w:w="4986"/>
@@ -4325,6 +4491,9 @@
         </w:tc>
       </w:tr>
       <w:tr>
+        <w:trPr>
+          <w:cantSplit/>
+        </w:trPr>
         <w:tc>
           <w:tcPr>
             <w:tcW w:type="dxa" w:w="4986"/>
@@ -4774,6 +4943,10 @@
         <w:gridCol w:w="3324"/>
       </w:tblGrid>
       <w:tr>
+        <w:trPr>
+          <w:cantSplit/>
+          <w:tblHeader/>
+        </w:trPr>
         <w:tc>
           <w:tcPr>
             <w:tcW w:type="dxa" w:w="3324"/>
@@ -4824,6 +4997,9 @@
         </w:tc>
       </w:tr>
       <w:tr>
+        <w:trPr>
+          <w:cantSplit/>
+        </w:trPr>
         <w:tc>
           <w:tcPr>
             <w:tcW w:type="dxa" w:w="3324"/>
@@ -4868,6 +5044,9 @@
         </w:tc>
       </w:tr>
       <w:tr>
+        <w:trPr>
+          <w:cantSplit/>
+        </w:trPr>
         <w:tc>
           <w:tcPr>
             <w:tcW w:type="dxa" w:w="3324"/>
@@ -4912,6 +5091,9 @@
         </w:tc>
       </w:tr>
       <w:tr>
+        <w:trPr>
+          <w:cantSplit/>
+        </w:trPr>
         <w:tc>
           <w:tcPr>
             <w:tcW w:type="dxa" w:w="3324"/>
@@ -4956,6 +5138,9 @@
         </w:tc>
       </w:tr>
       <w:tr>
+        <w:trPr>
+          <w:cantSplit/>
+        </w:trPr>
         <w:tc>
           <w:tcPr>
             <w:tcW w:type="dxa" w:w="3324"/>
@@ -5420,6 +5605,10 @@
         <w:gridCol w:w="3324"/>
       </w:tblGrid>
       <w:tr>
+        <w:trPr>
+          <w:cantSplit/>
+          <w:tblHeader/>
+        </w:trPr>
         <w:tc>
           <w:tcPr>
             <w:tcW w:type="dxa" w:w="3324"/>
@@ -5470,6 +5659,9 @@
         </w:tc>
       </w:tr>
       <w:tr>
+        <w:trPr>
+          <w:cantSplit/>
+        </w:trPr>
         <w:tc>
           <w:tcPr>
             <w:tcW w:type="dxa" w:w="3324"/>
@@ -5514,6 +5706,9 @@
         </w:tc>
       </w:tr>
       <w:tr>
+        <w:trPr>
+          <w:cantSplit/>
+        </w:trPr>
         <w:tc>
           <w:tcPr>
             <w:tcW w:type="dxa" w:w="3324"/>
@@ -5558,6 +5753,9 @@
         </w:tc>
       </w:tr>
       <w:tr>
+        <w:trPr>
+          <w:cantSplit/>
+        </w:trPr>
         <w:tc>
           <w:tcPr>
             <w:tcW w:type="dxa" w:w="3324"/>
@@ -5602,6 +5800,9 @@
         </w:tc>
       </w:tr>
       <w:tr>
+        <w:trPr>
+          <w:cantSplit/>
+        </w:trPr>
         <w:tc>
           <w:tcPr>
             <w:tcW w:type="dxa" w:w="3324"/>
@@ -6085,6 +6286,10 @@
         <w:gridCol w:w="4986"/>
       </w:tblGrid>
       <w:tr>
+        <w:trPr>
+          <w:cantSplit/>
+          <w:tblHeader/>
+        </w:trPr>
         <w:tc>
           <w:tcPr>
             <w:tcW w:type="dxa" w:w="4986"/>
@@ -6119,6 +6324,9 @@
         </w:tc>
       </w:tr>
       <w:tr>
+        <w:trPr>
+          <w:cantSplit/>
+        </w:trPr>
         <w:tc>
           <w:tcPr>
             <w:tcW w:type="dxa" w:w="4986"/>
@@ -6149,6 +6357,9 @@
         </w:tc>
       </w:tr>
       <w:tr>
+        <w:trPr>
+          <w:cantSplit/>
+        </w:trPr>
         <w:tc>
           <w:tcPr>
             <w:tcW w:type="dxa" w:w="4986"/>
@@ -6179,6 +6390,9 @@
         </w:tc>
       </w:tr>
       <w:tr>
+        <w:trPr>
+          <w:cantSplit/>
+        </w:trPr>
         <w:tc>
           <w:tcPr>
             <w:tcW w:type="dxa" w:w="4986"/>
@@ -6209,6 +6423,9 @@
         </w:tc>
       </w:tr>
       <w:tr>
+        <w:trPr>
+          <w:cantSplit/>
+        </w:trPr>
         <w:tc>
           <w:tcPr>
             <w:tcW w:type="dxa" w:w="4986"/>
@@ -6239,6 +6456,9 @@
         </w:tc>
       </w:tr>
       <w:tr>
+        <w:trPr>
+          <w:cantSplit/>
+        </w:trPr>
         <w:tc>
           <w:tcPr>
             <w:tcW w:type="dxa" w:w="4986"/>
@@ -6269,6 +6489,9 @@
         </w:tc>
       </w:tr>
       <w:tr>
+        <w:trPr>
+          <w:cantSplit/>
+        </w:trPr>
         <w:tc>
           <w:tcPr>
             <w:tcW w:type="dxa" w:w="4986"/>
@@ -6719,6 +6942,10 @@
         <w:gridCol w:w="4986"/>
       </w:tblGrid>
       <w:tr>
+        <w:trPr>
+          <w:cantSplit/>
+          <w:tblHeader/>
+        </w:trPr>
         <w:tc>
           <w:tcPr>
             <w:tcW w:type="dxa" w:w="4986"/>
@@ -6753,6 +6980,9 @@
         </w:tc>
       </w:tr>
       <w:tr>
+        <w:trPr>
+          <w:cantSplit/>
+        </w:trPr>
         <w:tc>
           <w:tcPr>
             <w:tcW w:type="dxa" w:w="4986"/>
@@ -6783,6 +7013,9 @@
         </w:tc>
       </w:tr>
       <w:tr>
+        <w:trPr>
+          <w:cantSplit/>
+        </w:trPr>
         <w:tc>
           <w:tcPr>
             <w:tcW w:type="dxa" w:w="4986"/>
@@ -6813,6 +7046,9 @@
         </w:tc>
       </w:tr>
       <w:tr>
+        <w:trPr>
+          <w:cantSplit/>
+        </w:trPr>
         <w:tc>
           <w:tcPr>
             <w:tcW w:type="dxa" w:w="4986"/>
@@ -6843,6 +7079,9 @@
         </w:tc>
       </w:tr>
       <w:tr>
+        <w:trPr>
+          <w:cantSplit/>
+        </w:trPr>
         <w:tc>
           <w:tcPr>
             <w:tcW w:type="dxa" w:w="4986"/>
@@ -6873,6 +7112,9 @@
         </w:tc>
       </w:tr>
       <w:tr>
+        <w:trPr>
+          <w:cantSplit/>
+        </w:trPr>
         <w:tc>
           <w:tcPr>
             <w:tcW w:type="dxa" w:w="4986"/>
@@ -6903,6 +7145,9 @@
         </w:tc>
       </w:tr>
       <w:tr>
+        <w:trPr>
+          <w:cantSplit/>
+        </w:trPr>
         <w:tc>
           <w:tcPr>
             <w:tcW w:type="dxa" w:w="4986"/>
@@ -6933,6 +7178,9 @@
         </w:tc>
       </w:tr>
       <w:tr>
+        <w:trPr>
+          <w:cantSplit/>
+        </w:trPr>
         <w:tc>
           <w:tcPr>
             <w:tcW w:type="dxa" w:w="4986"/>
@@ -6963,6 +7211,9 @@
         </w:tc>
       </w:tr>
       <w:tr>
+        <w:trPr>
+          <w:cantSplit/>
+        </w:trPr>
         <w:tc>
           <w:tcPr>
             <w:tcW w:type="dxa" w:w="4986"/>
@@ -7083,6 +7334,10 @@
         <w:gridCol w:w="4986"/>
       </w:tblGrid>
       <w:tr>
+        <w:trPr>
+          <w:cantSplit/>
+          <w:tblHeader/>
+        </w:trPr>
         <w:tc>
           <w:tcPr>
             <w:tcW w:type="dxa" w:w="4986"/>
@@ -7117,6 +7372,9 @@
         </w:tc>
       </w:tr>
       <w:tr>
+        <w:trPr>
+          <w:cantSplit/>
+        </w:trPr>
         <w:tc>
           <w:tcPr>
             <w:tcW w:type="dxa" w:w="4986"/>
@@ -7147,6 +7405,9 @@
         </w:tc>
       </w:tr>
       <w:tr>
+        <w:trPr>
+          <w:cantSplit/>
+        </w:trPr>
         <w:tc>
           <w:tcPr>
             <w:tcW w:type="dxa" w:w="4986"/>
@@ -7177,6 +7438,9 @@
         </w:tc>
       </w:tr>
       <w:tr>
+        <w:trPr>
+          <w:cantSplit/>
+        </w:trPr>
         <w:tc>
           <w:tcPr>
             <w:tcW w:type="dxa" w:w="4986"/>
@@ -7207,6 +7471,9 @@
         </w:tc>
       </w:tr>
       <w:tr>
+        <w:trPr>
+          <w:cantSplit/>
+        </w:trPr>
         <w:tc>
           <w:tcPr>
             <w:tcW w:type="dxa" w:w="4986"/>
@@ -7237,6 +7504,9 @@
         </w:tc>
       </w:tr>
       <w:tr>
+        <w:trPr>
+          <w:cantSplit/>
+        </w:trPr>
         <w:tc>
           <w:tcPr>
             <w:tcW w:type="dxa" w:w="4986"/>
@@ -7267,6 +7537,9 @@
         </w:tc>
       </w:tr>
       <w:tr>
+        <w:trPr>
+          <w:cantSplit/>
+        </w:trPr>
         <w:tc>
           <w:tcPr>
             <w:tcW w:type="dxa" w:w="4986"/>
@@ -7297,6 +7570,9 @@
         </w:tc>
       </w:tr>
       <w:tr>
+        <w:trPr>
+          <w:cantSplit/>
+        </w:trPr>
         <w:tc>
           <w:tcPr>
             <w:tcW w:type="dxa" w:w="4986"/>
@@ -7327,6 +7603,9 @@
         </w:tc>
       </w:tr>
       <w:tr>
+        <w:trPr>
+          <w:cantSplit/>
+        </w:trPr>
         <w:tc>
           <w:tcPr>
             <w:tcW w:type="dxa" w:w="4986"/>
@@ -7357,6 +7636,9 @@
         </w:tc>
       </w:tr>
       <w:tr>
+        <w:trPr>
+          <w:cantSplit/>
+        </w:trPr>
         <w:tc>
           <w:tcPr>
             <w:tcW w:type="dxa" w:w="4986"/>
@@ -7413,6 +7695,10 @@
         <w:gridCol w:w="3324"/>
       </w:tblGrid>
       <w:tr>
+        <w:trPr>
+          <w:cantSplit/>
+          <w:tblHeader/>
+        </w:trPr>
         <w:tc>
           <w:tcPr>
             <w:tcW w:type="dxa" w:w="3324"/>
@@ -7463,6 +7749,9 @@
         </w:tc>
       </w:tr>
       <w:tr>
+        <w:trPr>
+          <w:cantSplit/>
+        </w:trPr>
         <w:tc>
           <w:tcPr>
             <w:tcW w:type="dxa" w:w="3324"/>
@@ -7507,6 +7796,9 @@
         </w:tc>
       </w:tr>
       <w:tr>
+        <w:trPr>
+          <w:cantSplit/>
+        </w:trPr>
         <w:tc>
           <w:tcPr>
             <w:tcW w:type="dxa" w:w="3324"/>
@@ -7551,6 +7843,9 @@
         </w:tc>
       </w:tr>
       <w:tr>
+        <w:trPr>
+          <w:cantSplit/>
+        </w:trPr>
         <w:tc>
           <w:tcPr>
             <w:tcW w:type="dxa" w:w="3324"/>
@@ -7595,6 +7890,9 @@
         </w:tc>
       </w:tr>
       <w:tr>
+        <w:trPr>
+          <w:cantSplit/>
+        </w:trPr>
         <w:tc>
           <w:tcPr>
             <w:tcW w:type="dxa" w:w="3324"/>
@@ -7639,6 +7937,9 @@
         </w:tc>
       </w:tr>
       <w:tr>
+        <w:trPr>
+          <w:cantSplit/>
+        </w:trPr>
         <w:tc>
           <w:tcPr>
             <w:tcW w:type="dxa" w:w="3324"/>
@@ -7683,6 +7984,9 @@
         </w:tc>
       </w:tr>
       <w:tr>
+        <w:trPr>
+          <w:cantSplit/>
+        </w:trPr>
         <w:tc>
           <w:tcPr>
             <w:tcW w:type="dxa" w:w="3324"/>
@@ -7727,6 +8031,9 @@
         </w:tc>
       </w:tr>
       <w:tr>
+        <w:trPr>
+          <w:cantSplit/>
+        </w:trPr>
         <w:tc>
           <w:tcPr>
             <w:tcW w:type="dxa" w:w="3324"/>
@@ -7771,6 +8078,9 @@
         </w:tc>
       </w:tr>
       <w:tr>
+        <w:trPr>
+          <w:cantSplit/>
+        </w:trPr>
         <w:tc>
           <w:tcPr>
             <w:tcW w:type="dxa" w:w="3324"/>
@@ -7840,6 +8150,10 @@
         <w:gridCol w:w="4986"/>
       </w:tblGrid>
       <w:tr>
+        <w:trPr>
+          <w:cantSplit/>
+          <w:tblHeader/>
+        </w:trPr>
         <w:tc>
           <w:tcPr>
             <w:tcW w:type="dxa" w:w="4986"/>
@@ -7874,6 +8188,9 @@
         </w:tc>
       </w:tr>
       <w:tr>
+        <w:trPr>
+          <w:cantSplit/>
+        </w:trPr>
         <w:tc>
           <w:tcPr>
             <w:tcW w:type="dxa" w:w="4986"/>
@@ -7904,6 +8221,9 @@
         </w:tc>
       </w:tr>
       <w:tr>
+        <w:trPr>
+          <w:cantSplit/>
+        </w:trPr>
         <w:tc>
           <w:tcPr>
             <w:tcW w:type="dxa" w:w="4986"/>
@@ -7934,6 +8254,9 @@
         </w:tc>
       </w:tr>
       <w:tr>
+        <w:trPr>
+          <w:cantSplit/>
+        </w:trPr>
         <w:tc>
           <w:tcPr>
             <w:tcW w:type="dxa" w:w="4986"/>
@@ -7964,6 +8287,9 @@
         </w:tc>
       </w:tr>
       <w:tr>
+        <w:trPr>
+          <w:cantSplit/>
+        </w:trPr>
         <w:tc>
           <w:tcPr>
             <w:tcW w:type="dxa" w:w="4986"/>
@@ -7994,6 +8320,9 @@
         </w:tc>
       </w:tr>
       <w:tr>
+        <w:trPr>
+          <w:cantSplit/>
+        </w:trPr>
         <w:tc>
           <w:tcPr>
             <w:tcW w:type="dxa" w:w="4986"/>
@@ -8024,6 +8353,9 @@
         </w:tc>
       </w:tr>
       <w:tr>
+        <w:trPr>
+          <w:cantSplit/>
+        </w:trPr>
         <w:tc>
           <w:tcPr>
             <w:tcW w:type="dxa" w:w="4986"/>
@@ -8054,6 +8386,9 @@
         </w:tc>
       </w:tr>
       <w:tr>
+        <w:trPr>
+          <w:cantSplit/>
+        </w:trPr>
         <w:tc>
           <w:tcPr>
             <w:tcW w:type="dxa" w:w="4986"/>
@@ -8084,6 +8419,9 @@
         </w:tc>
       </w:tr>
       <w:tr>
+        <w:trPr>
+          <w:cantSplit/>
+        </w:trPr>
         <w:tc>
           <w:tcPr>
             <w:tcW w:type="dxa" w:w="4986"/>
@@ -8114,6 +8452,9 @@
         </w:tc>
       </w:tr>
       <w:tr>
+        <w:trPr>
+          <w:cantSplit/>
+        </w:trPr>
         <w:tc>
           <w:tcPr>
             <w:tcW w:type="dxa" w:w="4986"/>
@@ -8144,6 +8485,9 @@
         </w:tc>
       </w:tr>
       <w:tr>
+        <w:trPr>
+          <w:cantSplit/>
+        </w:trPr>
         <w:tc>
           <w:tcPr>
             <w:tcW w:type="dxa" w:w="4986"/>
@@ -8178,6 +8522,1542 @@
       <w:pPr>
         <w:spacing w:after="0"/>
       </w:pPr>
+    </w:p>
+    <w:p>
+      <w:pPr>
+        <w:pStyle w:val="Heading1"/>
+      </w:pPr>
+      <w:r>
+        <w:t>17. İşi Parçalara Bölme</w:t>
+      </w:r>
+    </w:p>
+    <w:p>
+      <w:r>
+        <w:rPr>
+          <w:b w:val="0"/>
+        </w:rPr>
+        <w:t xml:space="preserve">Ajan döngüsü (bölüm 3) tek bir konuşma turunu yürütür. Büyük işler ise </w:t>
+      </w:r>
+      <w:r>
+        <w:rPr>
+          <w:b/>
+        </w:rPr>
+        <w:t>köprü</w:t>
+      </w:r>
+      <w:r>
+        <w:rPr>
+          <w:b w:val="0"/>
+        </w:rPr>
+        <w:t xml:space="preserve"> (`AgentBridge`) üzerinden parçalanır: görev → adım → kaynak ihtiyacına göre </w:t>
+      </w:r>
+      <w:r>
+        <w:rPr>
+          <w:b/>
+        </w:rPr>
+        <w:t>parça</w:t>
+      </w:r>
+      <w:r>
+        <w:rPr>
+          <w:b w:val="0"/>
+        </w:rPr>
+        <w:t xml:space="preserve"> → sırayla/paralel yürütme → günlük. Amaç: uzun işi kesintiye dayanıklı, kaynak sınırına uyan küçük birimlere ayırmak.</w:t>
+      </w:r>
+    </w:p>
+    <w:p>
+      <w:pPr>
+        <w:spacing w:before="0" w:after="0" w:line="240" w:lineRule="auto"/>
+        <w:ind w:left="227"/>
+        <w:shd w:val="clear" w:color="auto" w:fill="F2F4F7"/>
+      </w:pPr>
+      <w:r>
+        <w:rPr>
+          <w:rFonts w:ascii="Consolas" w:hAnsi="Consolas"/>
+          <w:color w:val="444444"/>
+          <w:sz w:val="16"/>
+        </w:rPr>
+        <w:t>görev (objective)</w:t>
+      </w:r>
+    </w:p>
+    <w:p>
+      <w:pPr>
+        <w:spacing w:before="0" w:after="0" w:line="240" w:lineRule="auto"/>
+        <w:ind w:left="227"/>
+        <w:shd w:val="clear" w:color="auto" w:fill="F2F4F7"/>
+      </w:pPr>
+      <w:r>
+        <w:rPr>
+          <w:rFonts w:ascii="Consolas" w:hAnsi="Consolas"/>
+          <w:color w:val="444444"/>
+          <w:sz w:val="16"/>
+        </w:rPr>
+        <w:t xml:space="preserve">   │ plan_steps()            # sözlük planı → WorkStep listesi</w:t>
+      </w:r>
+    </w:p>
+    <w:p>
+      <w:pPr>
+        <w:spacing w:before="0" w:after="0" w:line="240" w:lineRule="auto"/>
+        <w:ind w:left="227"/>
+        <w:shd w:val="clear" w:color="auto" w:fill="F2F4F7"/>
+      </w:pPr>
+      <w:r>
+        <w:rPr>
+          <w:rFonts w:ascii="Consolas" w:hAnsi="Consolas"/>
+          <w:color w:val="444444"/>
+          <w:sz w:val="16"/>
+        </w:rPr>
+        <w:t xml:space="preserve">   ▼</w:t>
+      </w:r>
+    </w:p>
+    <w:p>
+      <w:pPr>
+        <w:spacing w:before="0" w:after="0" w:line="240" w:lineRule="auto"/>
+        <w:ind w:left="227"/>
+        <w:shd w:val="clear" w:color="auto" w:fill="F2F4F7"/>
+      </w:pPr>
+      <w:r>
+        <w:rPr>
+          <w:rFonts w:ascii="Consolas" w:hAnsi="Consolas"/>
+          <w:color w:val="444444"/>
+          <w:sz w:val="16"/>
+        </w:rPr>
+        <w:t>WorkStep × N  (her biri: needs{cpu, ram_mb, vram_mb}, depends_on, estimate_s)</w:t>
+      </w:r>
+    </w:p>
+    <w:p>
+      <w:pPr>
+        <w:spacing w:before="0" w:after="0" w:line="240" w:lineRule="auto"/>
+        <w:ind w:left="227"/>
+        <w:shd w:val="clear" w:color="auto" w:fill="F2F4F7"/>
+      </w:pPr>
+      <w:r>
+        <w:rPr>
+          <w:rFonts w:ascii="Consolas" w:hAnsi="Consolas"/>
+          <w:color w:val="444444"/>
+          <w:sz w:val="16"/>
+        </w:rPr>
+        <w:t xml:space="preserve">   │ _chunk_ceiling() + chunk_ratio       # kaynak bütçesine göre grupla</w:t>
+      </w:r>
+    </w:p>
+    <w:p>
+      <w:pPr>
+        <w:spacing w:before="0" w:after="0" w:line="240" w:lineRule="auto"/>
+        <w:ind w:left="227"/>
+        <w:shd w:val="clear" w:color="auto" w:fill="F2F4F7"/>
+      </w:pPr>
+      <w:r>
+        <w:rPr>
+          <w:rFonts w:ascii="Consolas" w:hAnsi="Consolas"/>
+          <w:color w:val="444444"/>
+          <w:sz w:val="16"/>
+        </w:rPr>
+        <w:t xml:space="preserve">   ▼</w:t>
+      </w:r>
+    </w:p>
+    <w:p>
+      <w:pPr>
+        <w:spacing w:before="0" w:after="0" w:line="240" w:lineRule="auto"/>
+        <w:ind w:left="227"/>
+        <w:shd w:val="clear" w:color="auto" w:fill="F2F4F7"/>
+      </w:pPr>
+      <w:r>
+        <w:rPr>
+          <w:rFonts w:ascii="Consolas" w:hAnsi="Consolas"/>
+          <w:color w:val="444444"/>
+          <w:sz w:val="16"/>
+        </w:rPr>
+        <w:t>WorkChunk × M  (parça = birlikte çalışan adımlar)</w:t>
+      </w:r>
+    </w:p>
+    <w:p>
+      <w:pPr>
+        <w:spacing w:before="0" w:after="0" w:line="240" w:lineRule="auto"/>
+        <w:ind w:left="227"/>
+        <w:shd w:val="clear" w:color="auto" w:fill="F2F4F7"/>
+      </w:pPr>
+      <w:r>
+        <w:rPr>
+          <w:rFonts w:ascii="Consolas" w:hAnsi="Consolas"/>
+          <w:color w:val="444444"/>
+          <w:sz w:val="16"/>
+        </w:rPr>
+        <w:t xml:space="preserve">   │ run() / run_until_done(poll_s=15)</w:t>
+      </w:r>
+    </w:p>
+    <w:p>
+      <w:pPr>
+        <w:spacing w:before="0" w:after="0" w:line="240" w:lineRule="auto"/>
+        <w:ind w:left="227"/>
+        <w:shd w:val="clear" w:color="auto" w:fill="F2F4F7"/>
+      </w:pPr>
+      <w:r>
+        <w:rPr>
+          <w:rFonts w:ascii="Consolas" w:hAnsi="Consolas"/>
+          <w:color w:val="444444"/>
+          <w:sz w:val="16"/>
+        </w:rPr>
+        <w:t xml:space="preserve">   ▼</w:t>
+      </w:r>
+    </w:p>
+    <w:p>
+      <w:pPr>
+        <w:spacing w:before="0" w:after="0" w:line="240" w:lineRule="auto"/>
+        <w:ind w:left="227"/>
+        <w:shd w:val="clear" w:color="auto" w:fill="F2F4F7"/>
+      </w:pPr>
+      <w:r>
+        <w:rPr>
+          <w:rFonts w:ascii="Consolas" w:hAnsi="Consolas"/>
+          <w:color w:val="444444"/>
+          <w:sz w:val="16"/>
+        </w:rPr>
+        <w:t>sonuç + WorkJournal (JSONL, eklemeli)  ──kesinti──▶  resume_state() / pending_steps()</w:t>
+      </w:r>
+    </w:p>
+    <w:p>
+      <w:pPr>
+        <w:pStyle w:val="Heading2"/>
+      </w:pPr>
+      <w:r>
+        <w:rPr>
+          <w:color w:val="1F3B73"/>
+        </w:rPr>
+        <w:t>17.1 Adım modeli (WorkStep)</w:t>
+      </w:r>
+    </w:p>
+    <w:tbl>
+      <w:tblPr>
+        <w:tblStyle w:val="TableGrid"/>
+        <w:tblW w:type="auto" w:w="0"/>
+        <w:jc w:val="center"/>
+        <w:tblLook w:firstColumn="1" w:firstRow="1" w:lastColumn="0" w:lastRow="0" w:noHBand="0" w:noVBand="1" w:val="04A0"/>
+      </w:tblPr>
+      <w:tblGrid>
+        <w:gridCol w:w="4986"/>
+        <w:gridCol w:w="4986"/>
+      </w:tblGrid>
+      <w:tr>
+        <w:trPr>
+          <w:cantSplit/>
+          <w:tblHeader/>
+        </w:trPr>
+        <w:tc>
+          <w:tcPr>
+            <w:tcW w:type="dxa" w:w="4986"/>
+          </w:tcPr>
+          <w:p>
+            <w:r/>
+            <w:r>
+              <w:rPr>
+                <w:b/>
+                <w:color w:val="1F3B73"/>
+                <w:sz w:val="18"/>
+              </w:rPr>
+              <w:t>Alan</w:t>
+            </w:r>
+          </w:p>
+        </w:tc>
+        <w:tc>
+          <w:tcPr>
+            <w:tcW w:type="dxa" w:w="4986"/>
+          </w:tcPr>
+          <w:p>
+            <w:r/>
+            <w:r>
+              <w:rPr>
+                <w:b/>
+                <w:color w:val="1F3B73"/>
+                <w:sz w:val="18"/>
+              </w:rPr>
+              <w:t>Anlam</w:t>
+            </w:r>
+          </w:p>
+        </w:tc>
+      </w:tr>
+      <w:tr>
+        <w:trPr>
+          <w:cantSplit/>
+        </w:trPr>
+        <w:tc>
+          <w:tcPr>
+            <w:tcW w:type="dxa" w:w="4986"/>
+          </w:tcPr>
+          <w:p>
+            <w:r/>
+            <w:r>
+              <w:rPr>
+                <w:sz w:val="18"/>
+              </w:rPr>
+              <w:t>id, title</w:t>
+            </w:r>
+          </w:p>
+        </w:tc>
+        <w:tc>
+          <w:tcPr>
+            <w:tcW w:type="dxa" w:w="4986"/>
+          </w:tcPr>
+          <w:p>
+            <w:r/>
+            <w:r>
+              <w:rPr>
+                <w:sz w:val="18"/>
+              </w:rPr>
+              <w:t>kimlik ve insan-okur başlık</w:t>
+            </w:r>
+          </w:p>
+        </w:tc>
+      </w:tr>
+      <w:tr>
+        <w:trPr>
+          <w:cantSplit/>
+        </w:trPr>
+        <w:tc>
+          <w:tcPr>
+            <w:tcW w:type="dxa" w:w="4986"/>
+          </w:tcPr>
+          <w:p>
+            <w:r/>
+            <w:r>
+              <w:rPr>
+                <w:sz w:val="18"/>
+              </w:rPr>
+              <w:t>kind</w:t>
+            </w:r>
+          </w:p>
+        </w:tc>
+        <w:tc>
+          <w:tcPr>
+            <w:tcW w:type="dxa" w:w="4986"/>
+          </w:tcPr>
+          <w:p>
+            <w:r/>
+            <w:r>
+              <w:rPr>
+                <w:sz w:val="18"/>
+              </w:rPr>
+              <w:t>`tool` (araç) · `think` (aday seçimi) · `generic`</w:t>
+            </w:r>
+          </w:p>
+        </w:tc>
+      </w:tr>
+      <w:tr>
+        <w:trPr>
+          <w:cantSplit/>
+        </w:trPr>
+        <w:tc>
+          <w:tcPr>
+            <w:tcW w:type="dxa" w:w="4986"/>
+          </w:tcPr>
+          <w:p>
+            <w:r/>
+            <w:r>
+              <w:rPr>
+                <w:sz w:val="18"/>
+              </w:rPr>
+              <w:t>needs</w:t>
+            </w:r>
+          </w:p>
+        </w:tc>
+        <w:tc>
+          <w:tcPr>
+            <w:tcW w:type="dxa" w:w="4986"/>
+          </w:tcPr>
+          <w:p>
+            <w:r/>
+            <w:r>
+              <w:rPr>
+                <w:sz w:val="18"/>
+              </w:rPr>
+              <w:t>`{cpu, ram_mb, vram_mb}` — yönetişim sığdırma kararı</w:t>
+            </w:r>
+          </w:p>
+        </w:tc>
+      </w:tr>
+      <w:tr>
+        <w:trPr>
+          <w:cantSplit/>
+        </w:trPr>
+        <w:tc>
+          <w:tcPr>
+            <w:tcW w:type="dxa" w:w="4986"/>
+          </w:tcPr>
+          <w:p>
+            <w:r/>
+            <w:r>
+              <w:rPr>
+                <w:sz w:val="18"/>
+              </w:rPr>
+              <w:t>depends_on</w:t>
+            </w:r>
+          </w:p>
+        </w:tc>
+        <w:tc>
+          <w:tcPr>
+            <w:tcW w:type="dxa" w:w="4986"/>
+          </w:tcPr>
+          <w:p>
+            <w:r/>
+            <w:r>
+              <w:rPr>
+                <w:sz w:val="18"/>
+              </w:rPr>
+              <w:t>önce bitmesi gereken adımlar (zincir)</w:t>
+            </w:r>
+          </w:p>
+        </w:tc>
+      </w:tr>
+      <w:tr>
+        <w:trPr>
+          <w:cantSplit/>
+        </w:trPr>
+        <w:tc>
+          <w:tcPr>
+            <w:tcW w:type="dxa" w:w="4986"/>
+          </w:tcPr>
+          <w:p>
+            <w:r/>
+            <w:r>
+              <w:rPr>
+                <w:sz w:val="18"/>
+              </w:rPr>
+              <w:t>estimate_s</w:t>
+            </w:r>
+          </w:p>
+        </w:tc>
+        <w:tc>
+          <w:tcPr>
+            <w:tcW w:type="dxa" w:w="4986"/>
+          </w:tcPr>
+          <w:p>
+            <w:r/>
+            <w:r>
+              <w:rPr>
+                <w:sz w:val="18"/>
+              </w:rPr>
+              <w:t>tahmini süre; sıralama ve parça dengesi için</w:t>
+            </w:r>
+          </w:p>
+        </w:tc>
+      </w:tr>
+      <w:tr>
+        <w:trPr>
+          <w:cantSplit/>
+        </w:trPr>
+        <w:tc>
+          <w:tcPr>
+            <w:tcW w:type="dxa" w:w="4986"/>
+          </w:tcPr>
+          <w:p>
+            <w:r/>
+            <w:r>
+              <w:rPr>
+                <w:sz w:val="18"/>
+              </w:rPr>
+              <w:t>status</w:t>
+            </w:r>
+          </w:p>
+        </w:tc>
+        <w:tc>
+          <w:tcPr>
+            <w:tcW w:type="dxa" w:w="4986"/>
+          </w:tcPr>
+          <w:p>
+            <w:r/>
+            <w:r>
+              <w:rPr>
+                <w:sz w:val="18"/>
+              </w:rPr>
+              <w:t>bekliyor · çalışıyor · bitti · atlandı · hata</w:t>
+            </w:r>
+          </w:p>
+        </w:tc>
+      </w:tr>
+      <w:tr>
+        <w:trPr>
+          <w:cantSplit/>
+        </w:trPr>
+        <w:tc>
+          <w:tcPr>
+            <w:tcW w:type="dxa" w:w="4986"/>
+          </w:tcPr>
+          <w:p>
+            <w:r/>
+            <w:r>
+              <w:rPr>
+                <w:sz w:val="18"/>
+              </w:rPr>
+              <w:t>chunk_id</w:t>
+            </w:r>
+          </w:p>
+        </w:tc>
+        <w:tc>
+          <w:tcPr>
+            <w:tcW w:type="dxa" w:w="4986"/>
+          </w:tcPr>
+          <w:p>
+            <w:r/>
+            <w:r>
+              <w:rPr>
+                <w:sz w:val="18"/>
+              </w:rPr>
+              <w:t>hangi parçaya atandı</w:t>
+            </w:r>
+          </w:p>
+        </w:tc>
+      </w:tr>
+    </w:tbl>
+    <w:p>
+      <w:pPr>
+        <w:spacing w:after="0"/>
+      </w:pPr>
+    </w:p>
+    <w:p>
+      <w:pPr>
+        <w:pStyle w:val="Heading2"/>
+      </w:pPr>
+      <w:r>
+        <w:rPr>
+          <w:color w:val="1F3B73"/>
+        </w:rPr>
+        <w:t>17.2 Bölme algoritması</w:t>
+      </w:r>
+    </w:p>
+    <w:p>
+      <w:pPr>
+        <w:spacing w:before="0" w:after="0" w:line="240" w:lineRule="auto"/>
+        <w:ind w:left="227"/>
+        <w:shd w:val="clear" w:color="auto" w:fill="F2F4F7"/>
+      </w:pPr>
+      <w:r>
+        <w:rPr>
+          <w:rFonts w:ascii="Consolas" w:hAnsi="Consolas"/>
+          <w:color w:val="444444"/>
+          <w:sz w:val="16"/>
+        </w:rPr>
+        <w:t>plan_steps(objective, plan):</w:t>
+      </w:r>
+    </w:p>
+    <w:p>
+      <w:pPr>
+        <w:spacing w:before="0" w:after="0" w:line="240" w:lineRule="auto"/>
+        <w:ind w:left="227"/>
+        <w:shd w:val="clear" w:color="auto" w:fill="F2F4F7"/>
+      </w:pPr>
+      <w:r>
+        <w:rPr>
+          <w:rFonts w:ascii="Consolas" w:hAnsi="Consolas"/>
+          <w:color w:val="444444"/>
+          <w:sz w:val="16"/>
+        </w:rPr>
+        <w:t>1  HER ham adım için:</w:t>
+      </w:r>
+    </w:p>
+    <w:p>
+      <w:pPr>
+        <w:spacing w:before="0" w:after="0" w:line="240" w:lineRule="auto"/>
+        <w:ind w:left="227"/>
+        <w:shd w:val="clear" w:color="auto" w:fill="F2F4F7"/>
+      </w:pPr>
+      <w:r>
+        <w:rPr>
+          <w:rFonts w:ascii="Consolas" w:hAnsi="Consolas"/>
+          <w:color w:val="444444"/>
+          <w:sz w:val="16"/>
+        </w:rPr>
+        <w:t>2      tur  ← ham.kind ∨ (candidates varsa "think" yoksa "tool")</w:t>
+      </w:r>
+    </w:p>
+    <w:p>
+      <w:pPr>
+        <w:spacing w:before="0" w:after="0" w:line="240" w:lineRule="auto"/>
+        <w:ind w:left="227"/>
+        <w:shd w:val="clear" w:color="auto" w:fill="F2F4F7"/>
+      </w:pPr>
+      <w:r>
+        <w:rPr>
+          <w:rFonts w:ascii="Consolas" w:hAnsi="Consolas"/>
+          <w:color w:val="444444"/>
+          <w:sz w:val="16"/>
+        </w:rPr>
+        <w:t>3      ihtiyaç ← ham.needs ∨ resources_for_tool(araç)     # aile varsayılanı</w:t>
+      </w:r>
+    </w:p>
+    <w:p>
+      <w:pPr>
+        <w:spacing w:before="0" w:after="0" w:line="240" w:lineRule="auto"/>
+        <w:ind w:left="227"/>
+        <w:shd w:val="clear" w:color="auto" w:fill="F2F4F7"/>
+      </w:pPr>
+      <w:r>
+        <w:rPr>
+          <w:rFonts w:ascii="Consolas" w:hAnsi="Consolas"/>
+          <w:color w:val="444444"/>
+          <w:sz w:val="16"/>
+        </w:rPr>
+        <w:t>4      süre ← ham.estimate_s ∨ estimate_for_tool(araç)</w:t>
+      </w:r>
+    </w:p>
+    <w:p>
+      <w:pPr>
+        <w:spacing w:before="0" w:after="0" w:line="240" w:lineRule="auto"/>
+        <w:ind w:left="227"/>
+        <w:shd w:val="clear" w:color="auto" w:fill="F2F4F7"/>
+      </w:pPr>
+      <w:r>
+        <w:rPr>
+          <w:rFonts w:ascii="Consolas" w:hAnsi="Consolas"/>
+          <w:color w:val="444444"/>
+          <w:sz w:val="16"/>
+        </w:rPr>
+        <w:t>5      EĞER ham.needs_previous → depends_on ← [önceki_adım]</w:t>
+      </w:r>
+    </w:p>
+    <w:p>
+      <w:pPr>
+        <w:spacing w:before="0" w:after="0" w:line="240" w:lineRule="auto"/>
+        <w:ind w:left="227"/>
+        <w:shd w:val="clear" w:color="auto" w:fill="F2F4F7"/>
+      </w:pPr>
+      <w:r>
+        <w:rPr>
+          <w:rFonts w:ascii="Consolas" w:hAnsi="Consolas"/>
+          <w:color w:val="444444"/>
+          <w:sz w:val="16"/>
+        </w:rPr>
+        <w:t>6      DÖNDÜR WorkStep(id=t000…, needs, depends_on, estimate_s)</w:t>
+      </w:r>
+    </w:p>
+    <w:p>
+      <w:pPr>
+        <w:spacing w:before="0" w:after="0" w:line="240" w:lineRule="auto"/>
+        <w:ind w:left="227"/>
+        <w:shd w:val="clear" w:color="auto" w:fill="F2F4F7"/>
+      </w:pPr>
+      <w:r>
+        <w:rPr>
+          <w:rFonts w:ascii="Consolas" w:hAnsi="Consolas"/>
+          <w:color w:val="444444"/>
+          <w:sz w:val="16"/>
+        </w:rPr>
+        <w:t xml:space="preserve"> </w:t>
+      </w:r>
+    </w:p>
+    <w:p>
+      <w:pPr>
+        <w:spacing w:before="0" w:after="0" w:line="240" w:lineRule="auto"/>
+        <w:ind w:left="227"/>
+        <w:shd w:val="clear" w:color="auto" w:fill="F2F4F7"/>
+      </w:pPr>
+      <w:r>
+        <w:rPr>
+          <w:rFonts w:ascii="Consolas" w:hAnsi="Consolas"/>
+          <w:color w:val="444444"/>
+          <w:sz w:val="16"/>
+        </w:rPr>
+        <w:t>parçala(bütçe):</w:t>
+      </w:r>
+    </w:p>
+    <w:p>
+      <w:pPr>
+        <w:spacing w:before="0" w:after="0" w:line="240" w:lineRule="auto"/>
+        <w:ind w:left="227"/>
+        <w:shd w:val="clear" w:color="auto" w:fill="F2F4F7"/>
+      </w:pPr>
+      <w:r>
+        <w:rPr>
+          <w:rFonts w:ascii="Consolas" w:hAnsi="Consolas"/>
+          <w:color w:val="444444"/>
+          <w:sz w:val="16"/>
+        </w:rPr>
+        <w:t>1  tavan ← bütçe × chunk_ratio                # bütçenin parça payı</w:t>
+      </w:r>
+    </w:p>
+    <w:p>
+      <w:pPr>
+        <w:spacing w:before="0" w:after="0" w:line="240" w:lineRule="auto"/>
+        <w:ind w:left="227"/>
+        <w:shd w:val="clear" w:color="auto" w:fill="F2F4F7"/>
+      </w:pPr>
+      <w:r>
+        <w:rPr>
+          <w:rFonts w:ascii="Consolas" w:hAnsi="Consolas"/>
+          <w:color w:val="444444"/>
+          <w:sz w:val="16"/>
+        </w:rPr>
+        <w:t>2  hedef_parça ← round(1 / chunk_ratio)       # parça boyu ile tutarlı</w:t>
+      </w:r>
+    </w:p>
+    <w:p>
+      <w:pPr>
+        <w:spacing w:before="0" w:after="0" w:line="240" w:lineRule="auto"/>
+        <w:ind w:left="227"/>
+        <w:shd w:val="clear" w:color="auto" w:fill="F2F4F7"/>
+      </w:pPr>
+      <w:r>
+        <w:rPr>
+          <w:rFonts w:ascii="Consolas" w:hAnsi="Consolas"/>
+          <w:color w:val="444444"/>
+          <w:sz w:val="16"/>
+        </w:rPr>
+        <w:t>3  DÖNGÜ adımlar (bağımlılık sırası korunarak):</w:t>
+      </w:r>
+    </w:p>
+    <w:p>
+      <w:pPr>
+        <w:spacing w:before="0" w:after="0" w:line="240" w:lineRule="auto"/>
+        <w:ind w:left="227"/>
+        <w:shd w:val="clear" w:color="auto" w:fill="F2F4F7"/>
+      </w:pPr>
+      <w:r>
+        <w:rPr>
+          <w:rFonts w:ascii="Consolas" w:hAnsi="Consolas"/>
+          <w:color w:val="444444"/>
+          <w:sz w:val="16"/>
+        </w:rPr>
+        <w:t>4      EĞER adım tavanı aşıyor → yeni parça aç</w:t>
+      </w:r>
+    </w:p>
+    <w:p>
+      <w:pPr>
+        <w:spacing w:before="0" w:after="0" w:line="240" w:lineRule="auto"/>
+        <w:ind w:left="227"/>
+        <w:shd w:val="clear" w:color="auto" w:fill="F2F4F7"/>
+      </w:pPr>
+      <w:r>
+        <w:rPr>
+          <w:rFonts w:ascii="Consolas" w:hAnsi="Consolas"/>
+          <w:color w:val="444444"/>
+          <w:sz w:val="16"/>
+        </w:rPr>
+        <w:t>5      EĞER chunk_steps (8) üst sınırına ulaşıldı → yeni parça</w:t>
+      </w:r>
+    </w:p>
+    <w:p>
+      <w:pPr>
+        <w:spacing w:before="0" w:after="0" w:line="240" w:lineRule="auto"/>
+        <w:ind w:left="227"/>
+        <w:shd w:val="clear" w:color="auto" w:fill="F2F4F7"/>
+      </w:pPr>
+      <w:r>
+        <w:rPr>
+          <w:rFonts w:ascii="Consolas" w:hAnsi="Consolas"/>
+          <w:color w:val="444444"/>
+          <w:sz w:val="16"/>
+        </w:rPr>
+        <w:t>6      adımı parçaya ata; chunk_id yaz</w:t>
+      </w:r>
+    </w:p>
+    <w:p>
+      <w:pPr>
+        <w:spacing w:before="0" w:after="0" w:line="240" w:lineRule="auto"/>
+        <w:ind w:left="227"/>
+        <w:shd w:val="clear" w:color="auto" w:fill="F2F4F7"/>
+      </w:pPr>
+      <w:r>
+        <w:rPr>
+          <w:rFonts w:ascii="Consolas" w:hAnsi="Consolas"/>
+          <w:color w:val="444444"/>
+          <w:sz w:val="16"/>
+        </w:rPr>
+        <w:t>7  DÖNDÜR WorkChunk listesi</w:t>
+      </w:r>
+    </w:p>
+    <w:p>
+      <w:pPr>
+        <w:spacing w:before="0" w:after="0" w:line="240" w:lineRule="auto"/>
+        <w:ind w:left="227"/>
+        <w:shd w:val="clear" w:color="auto" w:fill="F2F4F7"/>
+      </w:pPr>
+      <w:r>
+        <w:rPr>
+          <w:rFonts w:ascii="Consolas" w:hAnsi="Consolas"/>
+          <w:color w:val="444444"/>
+          <w:sz w:val="16"/>
+        </w:rPr>
+        <w:t xml:space="preserve"> </w:t>
+      </w:r>
+    </w:p>
+    <w:p>
+      <w:pPr>
+        <w:spacing w:before="0" w:after="0" w:line="240" w:lineRule="auto"/>
+        <w:ind w:left="227"/>
+        <w:shd w:val="clear" w:color="auto" w:fill="F2F4F7"/>
+      </w:pPr>
+      <w:r>
+        <w:rPr>
+          <w:rFonts w:ascii="Consolas" w:hAnsi="Consolas"/>
+          <w:color w:val="444444"/>
+          <w:sz w:val="16"/>
+        </w:rPr>
+        <w:t>yürüt(snapshot, max_chunks):</w:t>
+      </w:r>
+    </w:p>
+    <w:p>
+      <w:pPr>
+        <w:spacing w:before="0" w:after="0" w:line="240" w:lineRule="auto"/>
+        <w:ind w:left="227"/>
+        <w:shd w:val="clear" w:color="auto" w:fill="F2F4F7"/>
+      </w:pPr>
+      <w:r>
+        <w:rPr>
+          <w:rFonts w:ascii="Consolas" w:hAnsi="Consolas"/>
+          <w:color w:val="444444"/>
+          <w:sz w:val="16"/>
+        </w:rPr>
+        <w:t>1  EĞER max_wait_s &gt; 0 → run_until_done(poll_s)   # kaynak/onay bekler</w:t>
+      </w:r>
+    </w:p>
+    <w:p>
+      <w:pPr>
+        <w:spacing w:before="0" w:after="0" w:line="240" w:lineRule="auto"/>
+        <w:ind w:left="227"/>
+        <w:shd w:val="clear" w:color="auto" w:fill="F2F4F7"/>
+      </w:pPr>
+      <w:r>
+        <w:rPr>
+          <w:rFonts w:ascii="Consolas" w:hAnsi="Consolas"/>
+          <w:color w:val="444444"/>
+          <w:sz w:val="16"/>
+        </w:rPr>
+        <w:t>2  DEĞİLSE            → run(max_chunks)</w:t>
+      </w:r>
+    </w:p>
+    <w:p>
+      <w:pPr>
+        <w:spacing w:before="0" w:after="0" w:line="240" w:lineRule="auto"/>
+        <w:ind w:left="227"/>
+        <w:shd w:val="clear" w:color="auto" w:fill="F2F4F7"/>
+      </w:pPr>
+      <w:r>
+        <w:rPr>
+          <w:rFonts w:ascii="Consolas" w:hAnsi="Consolas"/>
+          <w:b w:val="0"/>
+          <w:color w:val="444444"/>
+          <w:sz w:val="16"/>
+        </w:rPr>
+        <w:t xml:space="preserve">3  sığmayan parça → </w:t>
+      </w:r>
+      <w:r>
+        <w:rPr>
+          <w:rFonts w:ascii="Consolas" w:hAnsi="Consolas"/>
+          <w:b/>
+          <w:color w:val="444444"/>
+          <w:sz w:val="16"/>
+        </w:rPr>
+        <w:t>ertelenir</w:t>
+      </w:r>
+      <w:r>
+        <w:rPr>
+          <w:rFonts w:ascii="Consolas" w:hAnsi="Consolas"/>
+          <w:b w:val="0"/>
+          <w:color w:val="444444"/>
+          <w:sz w:val="16"/>
+        </w:rPr>
+        <w:t xml:space="preserve"> (chunks_deferred), sonra yeniden denenir</w:t>
+      </w:r>
+    </w:p>
+    <w:p>
+      <w:pPr>
+        <w:spacing w:before="0" w:after="0" w:line="240" w:lineRule="auto"/>
+        <w:ind w:left="227"/>
+        <w:shd w:val="clear" w:color="auto" w:fill="F2F4F7"/>
+      </w:pPr>
+      <w:r>
+        <w:rPr>
+          <w:rFonts w:ascii="Consolas" w:hAnsi="Consolas"/>
+          <w:color w:val="444444"/>
+          <w:sz w:val="16"/>
+        </w:rPr>
+        <w:t>4  HER adım sonucu günlüğe yazılır (JSONL)</w:t>
+      </w:r>
+    </w:p>
+    <w:p>
+      <w:pPr>
+        <w:pStyle w:val="Heading2"/>
+      </w:pPr>
+      <w:r>
+        <w:rPr>
+          <w:color w:val="1F3B73"/>
+        </w:rPr>
+        <w:t>17.3 Kesintiye dayanıklılık</w:t>
+      </w:r>
+    </w:p>
+    <w:p>
+      <w:r>
+        <w:rPr>
+          <w:b w:val="0"/>
+        </w:rPr>
+        <w:t xml:space="preserve">Günlük </w:t>
+      </w:r>
+      <w:r>
+        <w:rPr>
+          <w:b/>
+        </w:rPr>
+        <w:t>JSONL</w:t>
+      </w:r>
+      <w:r>
+        <w:rPr>
+          <w:b w:val="0"/>
+        </w:rPr>
+        <w:t xml:space="preserve"> (satır başına bir kayıt) tutulur. Tek bir JSON dosyası yazılırken kesinti olursa </w:t>
+      </w:r>
+      <w:r>
+        <w:rPr>
+          <w:b/>
+        </w:rPr>
+        <w:t>tümü</w:t>
+      </w:r>
+      <w:r>
+        <w:rPr>
+          <w:b w:val="0"/>
+        </w:rPr>
+        <w:t xml:space="preserve"> kaybolurdu; JSONL'de yarım kalan son satır atlanır, öncekiler okunur. Kesintiden sonra `resume_state()` kaldığı yeri, `pending_steps()` kalan adımları bildirir; iş yeniden planlanmadan sürer.</w:t>
+      </w:r>
+    </w:p>
+    <w:p>
+      <w:r>
+        <w:t>Parça içindeki `think` adımı, düşünme döngüsünü (bölüm 4) kullanır: adaylar verilir, yerel model seçer, seçim günlüğe yazılır. Onay gerektiren adımlar `pending_approvals()` ile raporlanır ve onaylanmadan çalışmaz.</w:t>
+      </w:r>
+    </w:p>
+    <w:p>
+      <w:pPr>
+        <w:pStyle w:val="Heading1"/>
+      </w:pPr>
+      <w:r>
+        <w:t>18. Sıfırdan İnşa: Geliştirme Aşamaları</w:t>
+      </w:r>
+    </w:p>
+    <w:p>
+      <w:r>
+        <w:rPr>
+          <w:b w:val="0"/>
+        </w:rPr>
+        <w:t xml:space="preserve">Proje boş bir klasörden bugünkü hâline </w:t>
+      </w:r>
+      <w:r>
+        <w:rPr>
+          <w:b/>
+        </w:rPr>
+        <w:t>ölçüm → kök neden → düzeltme → test → rapor</w:t>
+      </w:r>
+      <w:r>
+        <w:rPr>
+          <w:b w:val="0"/>
+        </w:rPr>
+        <w:t xml:space="preserve"> döngüsüyle geldi. Her aşamada önce ölçüldü, sonra değiştirildi; hiçbir iyileştirme 'ölçülmeden' kabul edilmedi.</w:t>
+      </w:r>
+    </w:p>
+    <w:tbl>
+      <w:tblPr>
+        <w:tblStyle w:val="TableGrid"/>
+        <w:tblW w:type="auto" w:w="0"/>
+        <w:jc w:val="center"/>
+        <w:tblLook w:firstColumn="1" w:firstRow="1" w:lastColumn="0" w:lastRow="0" w:noHBand="0" w:noVBand="1" w:val="04A0"/>
+      </w:tblPr>
+      <w:tblGrid>
+        <w:gridCol w:w="3324"/>
+        <w:gridCol w:w="3324"/>
+        <w:gridCol w:w="3324"/>
+      </w:tblGrid>
+      <w:tr>
+        <w:trPr>
+          <w:cantSplit/>
+          <w:tblHeader/>
+        </w:trPr>
+        <w:tc>
+          <w:tcPr>
+            <w:tcW w:type="dxa" w:w="3324"/>
+          </w:tcPr>
+          <w:p>
+            <w:r/>
+            <w:r>
+              <w:rPr>
+                <w:b/>
+                <w:color w:val="1F3B73"/>
+                <w:sz w:val="18"/>
+              </w:rPr>
+              <w:t>Aşama</w:t>
+            </w:r>
+          </w:p>
+        </w:tc>
+        <w:tc>
+          <w:tcPr>
+            <w:tcW w:type="dxa" w:w="3324"/>
+          </w:tcPr>
+          <w:p>
+            <w:r/>
+            <w:r>
+              <w:rPr>
+                <w:b/>
+                <w:color w:val="1F3B73"/>
+                <w:sz w:val="18"/>
+              </w:rPr>
+              <w:t>Ne yapıldı</w:t>
+            </w:r>
+          </w:p>
+        </w:tc>
+        <w:tc>
+          <w:tcPr>
+            <w:tcW w:type="dxa" w:w="3324"/>
+          </w:tcPr>
+          <w:p>
+            <w:r/>
+            <w:r>
+              <w:rPr>
+                <w:b/>
+                <w:color w:val="1F3B73"/>
+                <w:sz w:val="18"/>
+              </w:rPr>
+              <w:t>Ölçülen sonuç / ders</w:t>
+            </w:r>
+          </w:p>
+        </w:tc>
+      </w:tr>
+      <w:tr>
+        <w:trPr>
+          <w:cantSplit/>
+        </w:trPr>
+        <w:tc>
+          <w:tcPr>
+            <w:tcW w:type="dxa" w:w="3324"/>
+          </w:tcPr>
+          <w:p>
+            <w:r/>
+            <w:r>
+              <w:rPr>
+                <w:sz w:val="18"/>
+              </w:rPr>
+              <w:t>0 · Doğrulama</w:t>
+            </w:r>
+          </w:p>
+        </w:tc>
+        <w:tc>
+          <w:tcPr>
+            <w:tcW w:type="dxa" w:w="3324"/>
+          </w:tcPr>
+          <w:p>
+            <w:r/>
+            <w:r>
+              <w:rPr>
+                <w:sz w:val="18"/>
+              </w:rPr>
+              <w:t>Mevcut durumun gerçekten öğrenip öğrenmediği ölçüldü</w:t>
+            </w:r>
+          </w:p>
+        </w:tc>
+        <w:tc>
+          <w:tcPr>
+            <w:tcW w:type="dxa" w:w="3324"/>
+          </w:tcPr>
+          <w:p>
+            <w:r>
+              <w:rPr>
+                <w:b w:val="0"/>
+              </w:rPr>
+              <w:t xml:space="preserve">Doğrulama kaybı </w:t>
+            </w:r>
+            <w:r>
+              <w:rPr>
+                <w:b/>
+              </w:rPr>
+              <w:t>hiç ölçülmüyordu</w:t>
+            </w:r>
+            <w:r>
+              <w:rPr>
+                <w:b w:val="0"/>
+              </w:rPr>
+              <w:t>; LR ömür boyu sayaç yüzünden 5e-06'ya sabitlenmişti; eğitim 61k havuz yerine 600 kasa notuyla yapılıyordu</w:t>
+            </w:r>
+          </w:p>
+        </w:tc>
+      </w:tr>
+      <w:tr>
+        <w:trPr>
+          <w:cantSplit/>
+        </w:trPr>
+        <w:tc>
+          <w:tcPr>
+            <w:tcW w:type="dxa" w:w="3324"/>
+          </w:tcPr>
+          <w:p>
+            <w:r/>
+            <w:r>
+              <w:rPr>
+                <w:sz w:val="18"/>
+              </w:rPr>
+              <w:t>1 · Veri havuzu</w:t>
+            </w:r>
+          </w:p>
+        </w:tc>
+        <w:tc>
+          <w:tcPr>
+            <w:tcW w:type="dxa" w:w="3324"/>
+          </w:tcPr>
+          <w:p>
+            <w:r/>
+            <w:r>
+              <w:rPr>
+                <w:sz w:val="18"/>
+              </w:rPr>
+              <w:t>61.195 kayıt tekilleştirildi, başlık grubu ile bölündü</w:t>
+            </w:r>
+          </w:p>
+        </w:tc>
+        <w:tc>
+          <w:tcPr>
+            <w:tcW w:type="dxa" w:w="3324"/>
+          </w:tcPr>
+          <w:p>
+            <w:r>
+              <w:rPr>
+                <w:b w:val="0"/>
+              </w:rPr>
+              <w:t xml:space="preserve">8.850 mükerrer (%14) → 52.345 tekil · v2: 44.422 eğitim / 4.018 doğrulama · içerik ve başlık sızıntısı </w:t>
+            </w:r>
+            <w:r>
+              <w:rPr>
+                <w:b/>
+              </w:rPr>
+              <w:t>0</w:t>
+            </w:r>
+          </w:p>
+        </w:tc>
+      </w:tr>
+      <w:tr>
+        <w:trPr>
+          <w:cantSplit/>
+        </w:trPr>
+        <w:tc>
+          <w:tcPr>
+            <w:tcW w:type="dxa" w:w="3324"/>
+          </w:tcPr>
+          <w:p>
+            <w:r/>
+            <w:r>
+              <w:rPr>
+                <w:sz w:val="18"/>
+              </w:rPr>
+              <w:t>2 · Eğitim</w:t>
+            </w:r>
+          </w:p>
+        </w:tc>
+        <w:tc>
+          <w:tcPr>
+            <w:tcW w:type="dxa" w:w="3324"/>
+          </w:tcPr>
+          <w:p>
+            <w:r/>
+            <w:r>
+              <w:rPr>
+                <w:sz w:val="18"/>
+              </w:rPr>
+              <w:t>Doğrulamalı eğitim; plan/veri/checkpoint hattı</w:t>
+            </w:r>
+          </w:p>
+        </w:tc>
+        <w:tc>
+          <w:tcPr>
+            <w:tcW w:type="dxa" w:w="3324"/>
+          </w:tcPr>
+          <w:p>
+            <w:r>
+              <w:rPr>
+                <w:b w:val="0"/>
+              </w:rPr>
+              <w:t>1.566 adım: doğrulama 2,6645 → 1,7704 (</w:t>
+            </w:r>
+            <w:r>
+              <w:rPr>
+                <w:b/>
+              </w:rPr>
+              <w:t>−%33,6</w:t>
+            </w:r>
+            <w:r>
+              <w:rPr>
+                <w:b w:val="0"/>
+              </w:rPr>
+              <w:t>); bugün toplam 15.904 adım · 107,46M token</w:t>
+            </w:r>
+          </w:p>
+        </w:tc>
+      </w:tr>
+      <w:tr>
+        <w:trPr>
+          <w:cantSplit/>
+        </w:trPr>
+        <w:tc>
+          <w:tcPr>
+            <w:tcW w:type="dxa" w:w="3324"/>
+          </w:tcPr>
+          <w:p>
+            <w:r/>
+            <w:r>
+              <w:rPr>
+                <w:sz w:val="18"/>
+              </w:rPr>
+              <w:t>3 · Değerlendirme</w:t>
+            </w:r>
+          </w:p>
+        </w:tc>
+        <w:tc>
+          <w:tcPr>
+            <w:tcW w:type="dxa" w:w="3324"/>
+          </w:tcPr>
+          <w:p>
+            <w:r/>
+            <w:r>
+              <w:rPr>
+                <w:sz w:val="18"/>
+              </w:rPr>
+              <w:t>Kalite kapısı ve üretim ölçümü</w:t>
+            </w:r>
+          </w:p>
+        </w:tc>
+        <w:tc>
+          <w:tcPr>
+            <w:tcW w:type="dxa" w:w="3324"/>
+          </w:tcPr>
+          <w:p>
+            <w:r>
+              <w:rPr>
+                <w:b w:val="0"/>
+              </w:rPr>
+              <w:t xml:space="preserve">Kapı çöpü kabul ediyordu (%16,7 gerçek kelime) → zorunlu sözcük ölçütü eklendi; kapı doğruluğu </w:t>
+            </w:r>
+            <w:r>
+              <w:rPr>
+                <w:b/>
+              </w:rPr>
+              <w:t>%100</w:t>
+            </w:r>
+          </w:p>
+        </w:tc>
+      </w:tr>
+      <w:tr>
+        <w:trPr>
+          <w:cantSplit/>
+        </w:trPr>
+        <w:tc>
+          <w:tcPr>
+            <w:tcW w:type="dxa" w:w="3324"/>
+          </w:tcPr>
+          <w:p>
+            <w:r/>
+            <w:r>
+              <w:rPr>
+                <w:sz w:val="18"/>
+              </w:rPr>
+              <w:t>4 · Düşünme + araştırma</w:t>
+            </w:r>
+          </w:p>
+        </w:tc>
+        <w:tc>
+          <w:tcPr>
+            <w:tcW w:type="dxa" w:w="3324"/>
+          </w:tcPr>
+          <w:p>
+            <w:r/>
+            <w:r>
+              <w:rPr>
+                <w:sz w:val="18"/>
+              </w:rPr>
+              <w:t>ThinkingLoop ajana bağlandı; araştırma araçları çekirdeğe</w:t>
+            </w:r>
+          </w:p>
+        </w:tc>
+        <w:tc>
+          <w:tcPr>
+            <w:tcW w:type="dxa" w:w="3324"/>
+          </w:tcPr>
+          <w:p>
+            <w:r>
+              <w:rPr>
+                <w:b w:val="0"/>
+              </w:rPr>
+              <w:t xml:space="preserve">`CORE_TOOLS` 25 → </w:t>
+            </w:r>
+            <w:r>
+              <w:rPr>
+                <w:b/>
+              </w:rPr>
+              <w:t>28</w:t>
+            </w:r>
+            <w:r>
+              <w:rPr>
+                <w:b w:val="0"/>
+              </w:rPr>
+              <w:t>; plan artık 3 aday arasından yerel modelle seçiliyor (0 → kullanımda)</w:t>
+            </w:r>
+          </w:p>
+        </w:tc>
+      </w:tr>
+      <w:tr>
+        <w:trPr>
+          <w:cantSplit/>
+        </w:trPr>
+        <w:tc>
+          <w:tcPr>
+            <w:tcW w:type="dxa" w:w="3324"/>
+          </w:tcPr>
+          <w:p>
+            <w:r/>
+            <w:r>
+              <w:rPr>
+                <w:sz w:val="18"/>
+              </w:rPr>
+              <w:t>5 · Talimat verisi</w:t>
+            </w:r>
+          </w:p>
+        </w:tc>
+        <w:tc>
+          <w:tcPr>
+            <w:tcW w:type="dxa" w:w="3324"/>
+          </w:tcPr>
+          <w:p>
+            <w:r/>
+            <w:r>
+              <w:rPr>
+                <w:sz w:val="18"/>
+              </w:rPr>
+              <w:t>Soru→cevap çiftleri; iki ayrı doğrulama</w:t>
+            </w:r>
+          </w:p>
+        </w:tc>
+        <w:tc>
+          <w:tcPr>
+            <w:tcW w:type="dxa" w:w="3324"/>
+          </w:tcPr>
+          <w:p>
+            <w:r/>
+            <w:r>
+              <w:rPr>
+                <w:sz w:val="18"/>
+              </w:rPr>
+              <w:t>6.010 çift (6.000 havuz + 10 elden DXGI/TDR); talimat kaybı −%18, belge kaybı +%18 (takas ölçüldü)</w:t>
+            </w:r>
+          </w:p>
+        </w:tc>
+      </w:tr>
+      <w:tr>
+        <w:trPr>
+          <w:cantSplit/>
+        </w:trPr>
+        <w:tc>
+          <w:tcPr>
+            <w:tcW w:type="dxa" w:w="3324"/>
+          </w:tcPr>
+          <w:p>
+            <w:r/>
+            <w:r>
+              <w:rPr>
+                <w:sz w:val="18"/>
+              </w:rPr>
+              <w:t>6 · Ortak havuz</w:t>
+            </w:r>
+          </w:p>
+        </w:tc>
+        <w:tc>
+          <w:tcPr>
+            <w:tcW w:type="dxa" w:w="3324"/>
+          </w:tcPr>
+          <w:p>
+            <w:r/>
+            <w:r>
+              <w:rPr>
+                <w:sz w:val="18"/>
+              </w:rPr>
+              <w:t>`/peer/job`, yaşam döngüsü, ajan iş paylaşımı</w:t>
+            </w:r>
+          </w:p>
+        </w:tc>
+        <w:tc>
+          <w:tcPr>
+            <w:tcW w:type="dxa" w:w="3324"/>
+          </w:tcPr>
+          <w:p>
+            <w:r/>
+            <w:r>
+              <w:rPr>
+                <w:sz w:val="18"/>
+              </w:rPr>
+              <w:t>Relay 6/6 ve iş paylaşımı 5/5; devralma 2,7 sn; tünel 6,3 sn</w:t>
+            </w:r>
+          </w:p>
+        </w:tc>
+      </w:tr>
+      <w:tr>
+        <w:trPr>
+          <w:cantSplit/>
+        </w:trPr>
+        <w:tc>
+          <w:tcPr>
+            <w:tcW w:type="dxa" w:w="3324"/>
+          </w:tcPr>
+          <w:p>
+            <w:r/>
+            <w:r>
+              <w:rPr>
+                <w:sz w:val="18"/>
+              </w:rPr>
+              <w:t>7 · Kararlılık</w:t>
+            </w:r>
+          </w:p>
+        </w:tc>
+        <w:tc>
+          <w:tcPr>
+            <w:tcW w:type="dxa" w:w="3324"/>
+          </w:tcPr>
+          <w:p>
+            <w:r/>
+            <w:r>
+              <w:rPr>
+                <w:sz w:val="18"/>
+              </w:rPr>
+              <w:t>Donanım/sürücü arızaları ve kasa gürültüsü</w:t>
+            </w:r>
+          </w:p>
+        </w:tc>
+        <w:tc>
+          <w:tcPr>
+            <w:tcW w:type="dxa" w:w="3324"/>
+          </w:tcPr>
+          <w:p>
+            <w:r>
+              <w:rPr>
+                <w:b w:val="0"/>
+              </w:rPr>
+              <w:t xml:space="preserve">GPU sürücüsü TDR ile sıfırlanıyordu (`nvlddmkm` 153) → `batch 8` ile 300 adım kesintisiz; ssh penceresi gizlendi; kasa için </w:t>
+            </w:r>
+            <w:r>
+              <w:rPr>
+                <w:b/>
+              </w:rPr>
+              <w:t>4 kalite kuralı</w:t>
+            </w:r>
+          </w:p>
+        </w:tc>
+      </w:tr>
+    </w:tbl>
+    <w:p>
+      <w:pPr>
+        <w:spacing w:after="0"/>
+      </w:pPr>
+    </w:p>
+    <w:p>
+      <w:pPr>
+        <w:pStyle w:val="Heading2"/>
+      </w:pPr>
+      <w:r>
+        <w:rPr>
+          <w:color w:val="1F3B73"/>
+        </w:rPr>
+        <w:t>18.1 Ayrı bir üretim hattı: Blender varlıkları</w:t>
+      </w:r>
+    </w:p>
+    <w:p>
+      <w:r>
+        <w:t>Blender tarafı 26 turda ayrı bir hat olarak kuruldu: 6 kategori varlık üretimi, 12 animasyon tarifi, 24 geçiş çifti, doku bulma/uygulama, UV dikiş, 4 açıdan önizleme ve 15 katman/54 derslik Blender mantık müfredatı. Bu hat, sistemin 'araç + doğrulama' yaklaşımının somut kanıtıdır.</w:t>
+      </w:r>
+    </w:p>
+    <w:p>
+      <w:pPr>
+        <w:pStyle w:val="Heading2"/>
+      </w:pPr>
+      <w:r>
+        <w:rPr>
+          <w:color w:val="1F3B73"/>
+        </w:rPr>
+        <w:t>18.2 Değişmez yöntem</w:t>
+      </w:r>
+    </w:p>
+    <w:p>
+      <w:pPr>
+        <w:spacing w:before="0" w:after="0" w:line="240" w:lineRule="auto"/>
+        <w:ind w:left="227"/>
+        <w:shd w:val="clear" w:color="auto" w:fill="F2F4F7"/>
+      </w:pPr>
+      <w:r>
+        <w:rPr>
+          <w:rFonts w:ascii="Consolas" w:hAnsi="Consolas"/>
+          <w:color w:val="444444"/>
+          <w:sz w:val="16"/>
+        </w:rPr>
+        <w:t>1  ÖLÇ      : mevcut davranışı sayıyla yaz (kayıp, süre, oran)</w:t>
+      </w:r>
+    </w:p>
+    <w:p>
+      <w:pPr>
+        <w:spacing w:before="0" w:after="0" w:line="240" w:lineRule="auto"/>
+        <w:ind w:left="227"/>
+        <w:shd w:val="clear" w:color="auto" w:fill="F2F4F7"/>
+      </w:pPr>
+      <w:r>
+        <w:rPr>
+          <w:rFonts w:ascii="Consolas" w:hAnsi="Consolas"/>
+          <w:color w:val="444444"/>
+          <w:sz w:val="16"/>
+        </w:rPr>
+        <w:t>2  KÖK NEDEN: tek tek hipotezleri ölçerek ele (BOS, maske, tokenizer…)</w:t>
+      </w:r>
+    </w:p>
+    <w:p>
+      <w:pPr>
+        <w:spacing w:before="0" w:after="0" w:line="240" w:lineRule="auto"/>
+        <w:ind w:left="227"/>
+        <w:shd w:val="clear" w:color="auto" w:fill="F2F4F7"/>
+      </w:pPr>
+      <w:r>
+        <w:rPr>
+          <w:rFonts w:ascii="Consolas" w:hAnsi="Consolas"/>
+          <w:color w:val="444444"/>
+          <w:sz w:val="16"/>
+        </w:rPr>
+        <w:t>3  DÜZELT   : en küçük değişiklik; sessiz yutma yok</w:t>
+      </w:r>
+    </w:p>
+    <w:p>
+      <w:pPr>
+        <w:spacing w:before="0" w:after="0" w:line="240" w:lineRule="auto"/>
+        <w:ind w:left="227"/>
+        <w:shd w:val="clear" w:color="auto" w:fill="F2F4F7"/>
+      </w:pPr>
+      <w:r>
+        <w:rPr>
+          <w:rFonts w:ascii="Consolas" w:hAnsi="Consolas"/>
+          <w:color w:val="444444"/>
+          <w:sz w:val="16"/>
+        </w:rPr>
+        <w:t>4  TEST     : ağsız birim testi + gerçek uçtan uca ölçüm</w:t>
+      </w:r>
+    </w:p>
+    <w:p>
+      <w:pPr>
+        <w:spacing w:before="0" w:after="0" w:line="240" w:lineRule="auto"/>
+        <w:ind w:left="227"/>
+        <w:shd w:val="clear" w:color="auto" w:fill="F2F4F7"/>
+      </w:pPr>
+      <w:r>
+        <w:rPr>
+          <w:rFonts w:ascii="Consolas" w:hAnsi="Consolas"/>
+          <w:color w:val="444444"/>
+          <w:sz w:val="16"/>
+        </w:rPr>
+        <w:t>5  RAPOR    : önce/sonra sayıları ve "kalıcı dersler" başlığı</w:t>
+      </w:r>
+    </w:p>
+    <w:p>
+      <w:pPr>
+        <w:spacing w:before="0" w:after="0" w:line="240" w:lineRule="auto"/>
+        <w:ind w:left="227"/>
+        <w:shd w:val="clear" w:color="auto" w:fill="F2F4F7"/>
+      </w:pPr>
+      <w:r>
+        <w:rPr>
+          <w:rFonts w:ascii="Consolas" w:hAnsi="Consolas"/>
+          <w:color w:val="444444"/>
+          <w:sz w:val="16"/>
+        </w:rPr>
+        <w:t>6  YAYIN    : commit + push; her iddia ölçüme bağlı</w:t>
+      </w:r>
     </w:p>
     <w:p>
       <w:pPr>

</xml_diff>